<commit_message>
Data obtained and started first exploration
I got the data set from Met Eireann, I started python exploration of data to merge the 3 data sets, I continued defining what a "good weather" looks like to use the parameters later on
</commit_message>
<xml_diff>
--- a/Business understanding.docx
+++ b/Business understanding.docx
@@ -208,109 +208,6 @@
     <w:p>
       <w:pPr>
         <w:rPr>
-          <w:color w:val="EE0000"/>
-        </w:rPr>
-      </w:pPr>
-    </w:p>
-    <w:p>
-      <w:pPr>
-        <w:rPr>
-          <w:color w:val="EE0000"/>
-        </w:rPr>
-      </w:pPr>
-    </w:p>
-    <w:p>
-      <w:pPr>
-        <w:rPr>
-          <w:color w:val="EE0000"/>
-        </w:rPr>
-      </w:pPr>
-      <w:r>
-        <w:rPr>
-          <w:color w:val="EE0000"/>
-        </w:rPr>
-        <w:t>Understand what the customer wants to accomplish from a business perspective</w:t>
-      </w:r>
-    </w:p>
-    <w:p>
-      <w:pPr>
-        <w:rPr>
-          <w:color w:val="EE0000"/>
-        </w:rPr>
-      </w:pPr>
-      <w:r>
-        <w:rPr>
-          <w:color w:val="EE0000"/>
-        </w:rPr>
-        <w:t xml:space="preserve">Set Objectives: Define primary objectives, what do I </w:t>
-      </w:r>
-      <w:proofErr w:type="spellStart"/>
-      <w:proofErr w:type="gramStart"/>
-      <w:r>
-        <w:rPr>
-          <w:color w:val="EE0000"/>
-        </w:rPr>
-        <w:t>cant</w:t>
-      </w:r>
-      <w:proofErr w:type="spellEnd"/>
-      <w:proofErr w:type="gramEnd"/>
-      <w:r>
-        <w:rPr>
-          <w:color w:val="EE0000"/>
-        </w:rPr>
-        <w:t xml:space="preserve"> to achieve</w:t>
-      </w:r>
-    </w:p>
-    <w:p>
-      <w:pPr>
-        <w:rPr>
-          <w:color w:val="EE0000"/>
-        </w:rPr>
-      </w:pPr>
-      <w:r>
-        <w:rPr>
-          <w:color w:val="EE0000"/>
-        </w:rPr>
-        <w:t>Produce a project plan: Specify the steps to be performed, including tools and techniques</w:t>
-      </w:r>
-    </w:p>
-    <w:p>
-      <w:pPr>
-        <w:rPr>
-          <w:color w:val="EE0000"/>
-        </w:rPr>
-      </w:pPr>
-      <w:r>
-        <w:rPr>
-          <w:color w:val="EE0000"/>
-        </w:rPr>
-        <w:t>Business success criteria: How will you measure the success</w:t>
-      </w:r>
-      <w:proofErr w:type="gramStart"/>
-      <w:r>
-        <w:rPr>
-          <w:color w:val="EE0000"/>
-        </w:rPr>
-        <w:t>? ,</w:t>
-      </w:r>
-      <w:proofErr w:type="gramEnd"/>
-      <w:r>
-        <w:rPr>
-          <w:color w:val="EE0000"/>
-        </w:rPr>
-        <w:t xml:space="preserve"> give useful insights into the relationships</w:t>
-      </w:r>
-    </w:p>
-    <w:p>
-      <w:pPr>
-        <w:rPr>
-          <w:color w:val="EE0000"/>
-        </w:rPr>
-      </w:pPr>
-    </w:p>
-    <w:p>
-      <w:pPr>
-        <w:rPr>
           <w:b/>
           <w:bCs/>
           <w:color w:val="EE0000"/>
@@ -328,13 +225,13 @@
     <w:p>
       <w:pPr>
         <w:rPr>
-          <w:color w:val="EE0000"/>
+          <w:color w:val="000000" w:themeColor="text1"/>
           <w:u w:val="single"/>
         </w:rPr>
       </w:pPr>
       <w:r>
         <w:rPr>
-          <w:color w:val="EE0000"/>
+          <w:color w:val="000000" w:themeColor="text1"/>
           <w:u w:val="single"/>
         </w:rPr>
         <w:t>Inventory of resources:</w:t>
@@ -401,13 +298,13 @@
     <w:p>
       <w:pPr>
         <w:rPr>
-          <w:color w:val="EE0000"/>
+          <w:color w:val="000000" w:themeColor="text1"/>
           <w:u w:val="single"/>
         </w:rPr>
       </w:pPr>
       <w:r>
         <w:rPr>
-          <w:color w:val="EE0000"/>
+          <w:color w:val="000000" w:themeColor="text1"/>
           <w:u w:val="single"/>
         </w:rPr>
         <w:t xml:space="preserve">Requirements, assumptions and constraints: </w:t>
@@ -485,255 +382,1017 @@
     <w:p>
       <w:pPr>
         <w:rPr>
-          <w:color w:val="EE0000"/>
+          <w:color w:val="000000" w:themeColor="text1"/>
           <w:u w:val="single"/>
         </w:rPr>
       </w:pPr>
       <w:r>
         <w:rPr>
-          <w:color w:val="EE0000"/>
+          <w:color w:val="000000" w:themeColor="text1"/>
           <w:u w:val="single"/>
         </w:rPr>
+        <w:t>Risks and contingencies</w:t>
+      </w:r>
+    </w:p>
+    <w:p>
+      <w:pPr>
+        <w:rPr>
+          <w:color w:val="000000" w:themeColor="text1"/>
+        </w:rPr>
+      </w:pPr>
+      <w:r>
+        <w:rPr>
+          <w:color w:val="000000" w:themeColor="text1"/>
+        </w:rPr>
+        <w:t>Risk: The</w:t>
+      </w:r>
+      <w:r>
+        <w:rPr>
+          <w:color w:val="000000" w:themeColor="text1"/>
+        </w:rPr>
+        <w:t xml:space="preserve"> hotel’s data set</w:t>
+      </w:r>
+      <w:r>
+        <w:rPr>
+          <w:color w:val="000000" w:themeColor="text1"/>
+        </w:rPr>
+        <w:t xml:space="preserve"> is longer</w:t>
+      </w:r>
+      <w:r>
+        <w:rPr>
+          <w:color w:val="000000" w:themeColor="text1"/>
+        </w:rPr>
+        <w:t xml:space="preserve"> and messy</w:t>
+      </w:r>
+      <w:r>
+        <w:rPr>
+          <w:color w:val="000000" w:themeColor="text1"/>
+        </w:rPr>
+        <w:t xml:space="preserve"> than expected</w:t>
+      </w:r>
+      <w:r>
+        <w:rPr>
+          <w:color w:val="000000" w:themeColor="text1"/>
+        </w:rPr>
+        <w:t xml:space="preserve">, risking the </w:t>
+      </w:r>
+      <w:proofErr w:type="gramStart"/>
+      <w:r>
+        <w:rPr>
+          <w:color w:val="000000" w:themeColor="text1"/>
+        </w:rPr>
+        <w:t>dead line</w:t>
+      </w:r>
+      <w:proofErr w:type="gramEnd"/>
+    </w:p>
+    <w:p>
+      <w:pPr>
+        <w:rPr>
+          <w:color w:val="000000" w:themeColor="text1"/>
+        </w:rPr>
+      </w:pPr>
+      <w:r>
+        <w:rPr>
+          <w:color w:val="000000" w:themeColor="text1"/>
+        </w:rPr>
+        <w:t xml:space="preserve">Contingency: </w:t>
+      </w:r>
+      <w:r>
+        <w:rPr>
+          <w:color w:val="000000" w:themeColor="text1"/>
+        </w:rPr>
+        <w:t>Focus on the historical data sets from 2 years till now</w:t>
+      </w:r>
+      <w:r>
+        <w:rPr>
+          <w:color w:val="000000" w:themeColor="text1"/>
+        </w:rPr>
+        <w:t xml:space="preserve"> and focus in only 1 hotel in 1 specific location of Dublin</w:t>
+      </w:r>
+    </w:p>
+    <w:p>
+      <w:pPr>
+        <w:rPr>
+          <w:color w:val="000000" w:themeColor="text1"/>
+        </w:rPr>
+      </w:pPr>
+      <w:r>
+        <w:rPr>
+          <w:color w:val="000000" w:themeColor="text1"/>
+        </w:rPr>
+        <w:t xml:space="preserve">Risk: </w:t>
+      </w:r>
+      <w:r>
+        <w:rPr>
+          <w:color w:val="000000" w:themeColor="text1"/>
+        </w:rPr>
+        <w:t>Random forest may be</w:t>
+      </w:r>
+      <w:r>
+        <w:rPr>
+          <w:color w:val="000000" w:themeColor="text1"/>
+        </w:rPr>
+        <w:t xml:space="preserve"> </w:t>
+      </w:r>
+      <w:r>
+        <w:rPr>
+          <w:color w:val="000000" w:themeColor="text1"/>
+        </w:rPr>
+        <w:t xml:space="preserve">a big model for a very local project. </w:t>
+      </w:r>
+    </w:p>
+    <w:p>
+      <w:pPr>
+        <w:rPr>
+          <w:color w:val="000000" w:themeColor="text1"/>
+        </w:rPr>
+      </w:pPr>
+      <w:r>
+        <w:rPr>
+          <w:color w:val="000000" w:themeColor="text1"/>
+        </w:rPr>
+        <w:t xml:space="preserve">Contingency: Random forest can be limited to only a few trees </w:t>
+      </w:r>
+    </w:p>
+    <w:p>
+      <w:pPr>
+        <w:rPr>
+          <w:color w:val="000000" w:themeColor="text1"/>
+          <w:u w:val="single"/>
+        </w:rPr>
+      </w:pPr>
+      <w:r>
+        <w:rPr>
+          <w:color w:val="000000" w:themeColor="text1"/>
+          <w:u w:val="single"/>
+        </w:rPr>
         <w:t xml:space="preserve">Terminology: </w:t>
       </w:r>
+    </w:p>
+    <w:p>
+      <w:r>
+        <w:t xml:space="preserve">Glossary </w:t>
+      </w:r>
+      <w:r>
+        <w:t>of Relevant Business Terminology</w:t>
+      </w:r>
+    </w:p>
+    <w:p>
+      <w:r>
+        <w:t>Understaffing: A situation here the number of employees scheduled is insufficient to meet guest demand, potentially leading to</w:t>
+      </w:r>
+      <w:r>
+        <w:t xml:space="preserve"> drop service quality and lost revenue.</w:t>
+      </w:r>
+    </w:p>
+    <w:p>
+      <w:r>
+        <w:t>Overstaffing: A situation where the hotel has more employees scheduled then necessary for the current workload</w:t>
+      </w:r>
+      <w:r>
+        <w:t xml:space="preserve">. </w:t>
+      </w:r>
+    </w:p>
+    <w:p>
+      <w:r>
+        <w:lastRenderedPageBreak/>
+        <w:t xml:space="preserve">Occupancy rate: </w:t>
+      </w:r>
+      <w:r>
+        <w:t xml:space="preserve">The ratio of rented room in use to the total </w:t>
+      </w:r>
+      <w:r>
+        <w:t>available rooms in the hotel</w:t>
+      </w:r>
+    </w:p>
+    <w:p>
+      <w:r>
+        <w:t>Demand Driver: An external factor such a concert, a football game or a specific weather condition</w:t>
+      </w:r>
+      <w:r>
+        <w:t xml:space="preserve"> that impact significantly on the amount of guest and their behaviour. </w:t>
+      </w:r>
+    </w:p>
+    <w:p>
+      <w:r>
+        <w:t xml:space="preserve">Glossary of Machine Learning Terminology </w:t>
+      </w:r>
+    </w:p>
+    <w:p>
+      <w:r>
+        <w:t xml:space="preserve">Target value (y): </w:t>
+      </w:r>
+      <w:r>
+        <w:t xml:space="preserve">The specific outcome to predict like the Optimal Staff count to </w:t>
+      </w:r>
+      <w:r>
+        <w:t>schedule at a given day</w:t>
+      </w:r>
+    </w:p>
+    <w:p>
+      <w:r>
+        <w:t xml:space="preserve">Features(x): The input </w:t>
+      </w:r>
+      <w:r>
+        <w:t xml:space="preserve">data used to predict (y), </w:t>
+      </w:r>
+      <w:r>
+        <w:t xml:space="preserve">such as “Precipitation” from Met Éireann </w:t>
+      </w:r>
+    </w:p>
+    <w:p>
+      <w:r>
+        <w:t xml:space="preserve">Random Fores: </w:t>
+      </w:r>
+      <w:r>
+        <w:t xml:space="preserve">A machine learning model that combines multiple “decision trees” to provide </w:t>
+      </w:r>
+      <w:r>
+        <w:t>more accurate and stable predictions</w:t>
+      </w:r>
+      <w:r>
+        <w:t xml:space="preserve"> </w:t>
+      </w:r>
+    </w:p>
+    <w:p>
+      <w:pPr>
+        <w:rPr>
+          <w:color w:val="EE0000"/>
+        </w:rPr>
+      </w:pPr>
+      <w:r>
+        <w:rPr>
+          <w:color w:val="EE0000"/>
+        </w:rPr>
+        <w:t>NOTE: EXTEND THIS GLOSSARY AFTER FINISHING THE PROJECT</w:t>
+      </w:r>
+    </w:p>
+    <w:p>
+      <w:pPr>
+        <w:rPr>
+          <w:color w:val="EE0000"/>
+        </w:rPr>
+      </w:pPr>
+    </w:p>
+    <w:p>
+      <w:pPr>
+        <w:rPr>
+          <w:u w:val="single"/>
+        </w:rPr>
+      </w:pPr>
+      <w:r>
+        <w:rPr>
+          <w:u w:val="single"/>
+        </w:rPr>
+        <w:t xml:space="preserve">Cost </w:t>
+      </w:r>
+      <w:r>
+        <w:rPr>
+          <w:u w:val="single"/>
+        </w:rPr>
+        <w:t xml:space="preserve">and </w:t>
+      </w:r>
+      <w:r>
+        <w:rPr>
+          <w:u w:val="single"/>
+        </w:rPr>
+        <w:t xml:space="preserve">benefit analysis </w:t>
+      </w:r>
+    </w:p>
+    <w:p>
+      <w:r>
+        <w:t xml:space="preserve">Estimated reject cost: </w:t>
+      </w:r>
+    </w:p>
+    <w:p>
+      <w:r>
+        <w:t>-Personnel: The Analyst is the primary cost</w:t>
+      </w:r>
+      <w:r>
+        <w:t>, the time spent on data cleaning, modelling and evaluation.</w:t>
+      </w:r>
+    </w:p>
+    <w:p>
+      <w:r>
+        <w:t>-Computing resources:</w:t>
+      </w:r>
+      <w:r>
+        <w:t xml:space="preserve"> Software </w:t>
+      </w:r>
+      <w:r>
+        <w:t>like Python/Scikit- Learn are zero cost as we are using open-source tools</w:t>
+      </w:r>
+    </w:p>
+    <w:p>
+      <w:r>
+        <w:t>- Pandas for data manipulations is free of charge</w:t>
+      </w:r>
+    </w:p>
+    <w:p>
+      <w:r>
+        <w:t>-</w:t>
+      </w:r>
+      <w:r>
+        <w:t xml:space="preserve">Data acquisition: </w:t>
+      </w:r>
+      <w:r>
+        <w:t>Accessing to Met Eireann and Kaggle data is currently free of charge</w:t>
+      </w:r>
+    </w:p>
+    <w:p>
+      <w:pPr>
+        <w:rPr>
+          <w:color w:val="EE0000"/>
+        </w:rPr>
+      </w:pPr>
+      <w:r>
+        <w:rPr>
+          <w:color w:val="EE0000"/>
+        </w:rPr>
+        <w:t>NOTE, WHAT ABOUT POWER BI, IS IT FREE</w:t>
+      </w:r>
+      <w:r>
+        <w:rPr>
+          <w:color w:val="EE0000"/>
+        </w:rPr>
+        <w:t>, DO I NEED CLOUD SERVICES</w:t>
+      </w:r>
+      <w:r>
+        <w:rPr>
+          <w:color w:val="EE0000"/>
+        </w:rPr>
+        <w:t>?</w:t>
+      </w:r>
+    </w:p>
+    <w:p>
+      <w:r>
+        <w:t xml:space="preserve">Potential Benefits: </w:t>
+      </w:r>
+    </w:p>
+    <w:p>
+      <w:r>
+        <w:t>-Reduced Labour waste: By predict low demand days, the hotel can avoid unnecessary staff.</w:t>
+      </w:r>
+    </w:p>
+    <w:p>
+      <w:r>
+        <w:t xml:space="preserve">-Revenue protection: On high demand days the hotel will be prepared with the right </w:t>
+      </w:r>
+      <w:r>
+        <w:t>number</w:t>
+      </w:r>
+      <w:r>
+        <w:t xml:space="preserve"> of staff, preventing a negative experience to the guests, avoiding bad reviews, and making their experience unforgettable. </w:t>
+      </w:r>
+    </w:p>
+    <w:p>
+      <w:r>
+        <w:t>-Operational efficiency: An automated system reduces the time for manager to manually check weather and calendar events individually.</w:t>
+      </w:r>
+    </w:p>
+    <w:p>
+      <w:pPr>
+        <w:rPr>
+          <w:color w:val="EE0000"/>
+        </w:rPr>
+      </w:pPr>
+    </w:p>
+    <w:p>
+      <w:r>
+        <w:t>Monetary Example</w:t>
+      </w:r>
+      <w:r>
+        <w:t xml:space="preserve"> </w:t>
+      </w:r>
+      <w:r>
+        <w:t>Specific Comparison</w:t>
+      </w:r>
+    </w:p>
+    <w:p>
+      <w:r>
+        <w:lastRenderedPageBreak/>
+        <w:t xml:space="preserve">Overstaffing: If we have 5 staff members paid 15 euro per hour on a rainy day or no busy day, then the loos is about 600 euro in salaries for that staff that will be hanging around. </w:t>
+      </w:r>
+    </w:p>
+    <w:p>
+      <w:r>
+        <w:t xml:space="preserve">Understaffing: If we didn’t consider the Tailor swift concert, that can lead to maybe 3 bad reviews on social media. </w:t>
+      </w:r>
+    </w:p>
+    <w:p>
+      <w:pPr>
+        <w:rPr>
+          <w:color w:val="EE0000"/>
+        </w:rPr>
+      </w:pPr>
+    </w:p>
+    <w:p>
+      <w:pPr>
+        <w:rPr>
+          <w:color w:val="EE0000"/>
+        </w:rPr>
+      </w:pPr>
+    </w:p>
+    <w:p>
+      <w:pPr>
+        <w:rPr>
+          <w:color w:val="EE0000"/>
+        </w:rPr>
+      </w:pPr>
     </w:p>
     <w:p>
       <w:pPr>
         <w:rPr>
           <w:b/>
           <w:bCs/>
+          <w:color w:val="EE0000"/>
         </w:rPr>
       </w:pPr>
       <w:r>
         <w:rPr>
           <w:b/>
           <w:bCs/>
-        </w:rPr>
-        <w:t xml:space="preserve">Glossary </w:t>
-      </w:r>
-      <w:r>
+          <w:color w:val="EE0000"/>
+        </w:rPr>
+        <w:t>Determine data mining/Machine Learning goals</w:t>
+      </w:r>
+    </w:p>
+    <w:p>
+      <w:pPr>
+        <w:rPr>
+          <w:u w:val="single"/>
+        </w:rPr>
+      </w:pPr>
+      <w:r>
+        <w:rPr>
+          <w:u w:val="single"/>
+        </w:rPr>
+        <w:t xml:space="preserve">Business Success Criteria: </w:t>
+      </w:r>
+    </w:p>
+    <w:p>
+      <w:r>
+        <w:t>Success will be achieved if the model can reduce overstaffing cost by at least 15% over a time of 3 months while maintaining a 4.5</w:t>
+      </w:r>
+      <w:r>
+        <w:t xml:space="preserve">/5 </w:t>
+      </w:r>
+      <w:r>
+        <w:t>star</w:t>
+      </w:r>
+      <w:r>
+        <w:t xml:space="preserve">s reviews on satisfaction rating. </w:t>
+      </w:r>
+    </w:p>
+    <w:p>
+      <w:pPr>
+        <w:rPr>
+          <w:u w:val="single"/>
+        </w:rPr>
+      </w:pPr>
+      <w:r>
+        <w:rPr>
+          <w:u w:val="single"/>
+        </w:rPr>
+        <w:t>Machine Learning Criteria:</w:t>
+      </w:r>
+    </w:p>
+    <w:p>
+      <w:r>
+        <w:t xml:space="preserve">The model should present </w:t>
+      </w:r>
+      <w:r>
+        <w:t>80% accuracy or higher</w:t>
+      </w:r>
+    </w:p>
+    <w:p>
+      <w:pPr>
+        <w:rPr>
+          <w:u w:val="single"/>
+        </w:rPr>
+      </w:pPr>
+    </w:p>
+    <w:p>
+      <w:pPr>
+        <w:rPr>
+          <w:u w:val="single"/>
+        </w:rPr>
+      </w:pPr>
+    </w:p>
+    <w:p>
+      <w:pPr>
+        <w:rPr>
+          <w:u w:val="single"/>
+        </w:rPr>
+      </w:pPr>
+    </w:p>
+    <w:p>
+      <w:pPr>
+        <w:rPr>
+          <w:u w:val="single"/>
+        </w:rPr>
+      </w:pPr>
+    </w:p>
+    <w:p>
+      <w:pPr>
         <w:rPr>
           <w:b/>
           <w:bCs/>
-        </w:rPr>
-        <w:t>of Relevant Business Terminology</w:t>
-      </w:r>
-    </w:p>
-    <w:p>
-      <w:r>
-        <w:lastRenderedPageBreak/>
-        <w:t>Understaffing: A situation here the number of employees scheduled is insufficient to meet guest demand, potentially leading to</w:t>
-      </w:r>
-      <w:r>
-        <w:t xml:space="preserve"> drop service quality and lost revenue.</w:t>
-      </w:r>
-    </w:p>
-    <w:p>
-      <w:r>
-        <w:t>Overstaffing: A situation where the hotel has more employees scheduled then necessary for the current workload</w:t>
-      </w:r>
-      <w:r>
-        <w:t xml:space="preserve">. </w:t>
-      </w:r>
-    </w:p>
-    <w:p>
-      <w:r>
-        <w:t xml:space="preserve">Occupancy rate: </w:t>
-      </w:r>
-      <w:r>
-        <w:t xml:space="preserve">The ratio of rented room in use to the total </w:t>
-      </w:r>
-      <w:r>
-        <w:t>available rooms in the hotel</w:t>
-      </w:r>
-    </w:p>
-    <w:p>
-      <w:r>
-        <w:t>Demand Driver: An external factor such a concert, a football game or a specific weather condition</w:t>
-      </w:r>
-      <w:r>
-        <w:t xml:space="preserve"> that impact significantly on the amount of guest and their behaviour. </w:t>
-      </w:r>
-    </w:p>
-    <w:p>
-      <w:pPr>
+          <w:color w:val="EE0000"/>
+        </w:rPr>
+      </w:pPr>
+      <w:r>
         <w:rPr>
           <w:b/>
           <w:bCs/>
-        </w:rPr>
-      </w:pPr>
-      <w:r>
+          <w:color w:val="EE0000"/>
+        </w:rPr>
+        <w:t>Produce project plan</w:t>
+      </w:r>
+    </w:p>
+    <w:tbl>
+      <w:tblPr>
+        <w:tblStyle w:val="TableGrid"/>
+        <w:tblW w:w="0" w:type="auto"/>
+        <w:tblLook w:val="04A0" w:firstRow="1" w:lastRow="0" w:firstColumn="1" w:lastColumn="0" w:noHBand="0" w:noVBand="1"/>
+      </w:tblPr>
+      <w:tblGrid>
+        <w:gridCol w:w="1797"/>
+        <w:gridCol w:w="1758"/>
+        <w:gridCol w:w="1778"/>
+        <w:gridCol w:w="1761"/>
+        <w:gridCol w:w="1922"/>
+      </w:tblGrid>
+      <w:tr>
+        <w:tc>
+          <w:tcPr>
+            <w:tcW w:w="1797" w:type="dxa"/>
+          </w:tcPr>
+          <w:p>
+            <w:r>
+              <w:t>PHASE</w:t>
+            </w:r>
+          </w:p>
+        </w:tc>
+        <w:tc>
+          <w:tcPr>
+            <w:tcW w:w="1758" w:type="dxa"/>
+          </w:tcPr>
+          <w:p>
+            <w:r>
+              <w:t>DURATION</w:t>
+            </w:r>
+          </w:p>
+        </w:tc>
+        <w:tc>
+          <w:tcPr>
+            <w:tcW w:w="1778" w:type="dxa"/>
+          </w:tcPr>
+          <w:p>
+            <w:r>
+              <w:t>INPUT</w:t>
+            </w:r>
+          </w:p>
+        </w:tc>
+        <w:tc>
+          <w:tcPr>
+            <w:tcW w:w="1761" w:type="dxa"/>
+          </w:tcPr>
+          <w:p>
+            <w:r>
+              <w:t xml:space="preserve">OUTPUT </w:t>
+            </w:r>
+          </w:p>
+        </w:tc>
+        <w:tc>
+          <w:tcPr>
+            <w:tcW w:w="1922" w:type="dxa"/>
+          </w:tcPr>
+          <w:p>
+            <w:r>
+              <w:t>DEPENDENC</w:t>
+            </w:r>
+            <w:r>
+              <w:t>IES</w:t>
+            </w:r>
+          </w:p>
+        </w:tc>
+      </w:tr>
+      <w:tr>
+        <w:tc>
+          <w:tcPr>
+            <w:tcW w:w="1797" w:type="dxa"/>
+          </w:tcPr>
+          <w:p>
+            <w:r>
+              <w:t xml:space="preserve">Business </w:t>
+            </w:r>
+          </w:p>
+          <w:p>
+            <w:r>
+              <w:t>Understanding</w:t>
+            </w:r>
+          </w:p>
+        </w:tc>
+        <w:tc>
+          <w:tcPr>
+            <w:tcW w:w="1758" w:type="dxa"/>
+          </w:tcPr>
+          <w:p>
+            <w:r>
+              <w:t>21</w:t>
+            </w:r>
+            <w:r>
+              <w:rPr>
+                <w:vertAlign w:val="superscript"/>
+              </w:rPr>
+              <w:t>st</w:t>
+            </w:r>
+            <w:r>
+              <w:t xml:space="preserve"> April</w:t>
+            </w:r>
+          </w:p>
+          <w:p>
+            <w:r>
+              <w:t>22</w:t>
+            </w:r>
+            <w:r>
+              <w:rPr>
+                <w:vertAlign w:val="superscript"/>
+              </w:rPr>
+              <w:t>nd</w:t>
+            </w:r>
+            <w:r>
+              <w:t xml:space="preserve"> April</w:t>
+            </w:r>
+          </w:p>
+        </w:tc>
+        <w:tc>
+          <w:tcPr>
+            <w:tcW w:w="1778" w:type="dxa"/>
+          </w:tcPr>
+          <w:p>
+            <w:r>
+              <w:t>Initial goals and notes</w:t>
+            </w:r>
+          </w:p>
+        </w:tc>
+        <w:tc>
+          <w:tcPr>
+            <w:tcW w:w="1761" w:type="dxa"/>
+          </w:tcPr>
+          <w:p>
+            <w:r>
+              <w:t xml:space="preserve">Finalized </w:t>
+            </w:r>
+            <w:r>
+              <w:t xml:space="preserve">plan, </w:t>
+            </w:r>
+            <w:r>
+              <w:t>objectives and c</w:t>
+            </w:r>
+            <w:r>
+              <w:t>riteria</w:t>
+            </w:r>
+          </w:p>
+        </w:tc>
+        <w:tc>
+          <w:tcPr>
+            <w:tcW w:w="1922" w:type="dxa"/>
+          </w:tcPr>
+          <w:p>
+            <w:r>
+              <w:t>None</w:t>
+            </w:r>
+          </w:p>
+        </w:tc>
+      </w:tr>
+      <w:tr>
+        <w:tc>
+          <w:tcPr>
+            <w:tcW w:w="1797" w:type="dxa"/>
+          </w:tcPr>
+          <w:p>
+            <w:r>
+              <w:t>Data</w:t>
+            </w:r>
+          </w:p>
+          <w:p>
+            <w:r>
+              <w:t>Understanding</w:t>
+            </w:r>
+          </w:p>
+        </w:tc>
+        <w:tc>
+          <w:tcPr>
+            <w:tcW w:w="1758" w:type="dxa"/>
+          </w:tcPr>
+          <w:p>
+            <w:r>
+              <w:t>23</w:t>
+            </w:r>
+            <w:r>
+              <w:rPr>
+                <w:vertAlign w:val="superscript"/>
+              </w:rPr>
+              <w:t>rd</w:t>
+            </w:r>
+            <w:r>
+              <w:t xml:space="preserve"> April-</w:t>
+            </w:r>
+          </w:p>
+          <w:p>
+            <w:r>
+              <w:t>30</w:t>
+            </w:r>
+            <w:proofErr w:type="gramStart"/>
+            <w:r>
+              <w:rPr>
+                <w:vertAlign w:val="superscript"/>
+              </w:rPr>
+              <w:t>th</w:t>
+            </w:r>
+            <w:r>
+              <w:t xml:space="preserve"> </w:t>
+            </w:r>
+            <w:r>
+              <w:t xml:space="preserve"> April</w:t>
+            </w:r>
+            <w:proofErr w:type="gramEnd"/>
+          </w:p>
+        </w:tc>
+        <w:tc>
+          <w:tcPr>
+            <w:tcW w:w="1778" w:type="dxa"/>
+          </w:tcPr>
+          <w:p>
+            <w:r>
+              <w:t>Datasets from:</w:t>
+            </w:r>
+          </w:p>
+          <w:p>
+            <w:r>
+              <w:t xml:space="preserve">Met </w:t>
+            </w:r>
+            <w:r>
+              <w:t>Eireann</w:t>
+            </w:r>
+            <w:r>
+              <w:t xml:space="preserve">, </w:t>
+            </w:r>
+          </w:p>
+          <w:p>
+            <w:r>
+              <w:t>Kaggle</w:t>
+            </w:r>
+            <w:r>
+              <w:t xml:space="preserve"> and personalized event list</w:t>
+            </w:r>
+          </w:p>
+        </w:tc>
+        <w:tc>
+          <w:tcPr>
+            <w:tcW w:w="1761" w:type="dxa"/>
+          </w:tcPr>
+          <w:p>
+            <w:r>
+              <w:t>Data exploration report, initial data quality check</w:t>
+            </w:r>
+          </w:p>
+        </w:tc>
+        <w:tc>
+          <w:tcPr>
+            <w:tcW w:w="1922" w:type="dxa"/>
+          </w:tcPr>
+          <w:p>
+            <w:r>
+              <w:t>Access to data</w:t>
+            </w:r>
+          </w:p>
+        </w:tc>
+      </w:tr>
+      <w:tr>
+        <w:tc>
+          <w:tcPr>
+            <w:tcW w:w="1797" w:type="dxa"/>
+          </w:tcPr>
+          <w:p>
+            <w:r>
+              <w:t>Data preparation</w:t>
+            </w:r>
+          </w:p>
+        </w:tc>
+        <w:tc>
+          <w:tcPr>
+            <w:tcW w:w="1758" w:type="dxa"/>
+          </w:tcPr>
+          <w:p>
+            <w:r>
+              <w:t>28</w:t>
+            </w:r>
+            <w:r>
+              <w:rPr>
+                <w:vertAlign w:val="superscript"/>
+              </w:rPr>
+              <w:t>th</w:t>
+            </w:r>
+            <w:r>
+              <w:t xml:space="preserve"> April- </w:t>
+            </w:r>
+          </w:p>
+          <w:p/>
+        </w:tc>
+        <w:tc>
+          <w:tcPr>
+            <w:tcW w:w="1778" w:type="dxa"/>
+          </w:tcPr>
+          <w:p>
+            <w:r>
+              <w:t>Raw data from 3 data sets</w:t>
+            </w:r>
+          </w:p>
+        </w:tc>
+        <w:tc>
+          <w:tcPr>
+            <w:tcW w:w="1761" w:type="dxa"/>
+          </w:tcPr>
+          <w:p>
+            <w:r>
+              <w:t>Merge the sets</w:t>
+            </w:r>
+          </w:p>
+        </w:tc>
+        <w:tc>
+          <w:tcPr>
+            <w:tcW w:w="1922" w:type="dxa"/>
+          </w:tcPr>
+          <w:p>
+            <w:r>
+              <w:t>Previous phase</w:t>
+            </w:r>
+          </w:p>
+        </w:tc>
+      </w:tr>
+      <w:tr>
+        <w:tc>
+          <w:tcPr>
+            <w:tcW w:w="1797" w:type="dxa"/>
+          </w:tcPr>
+          <w:p>
+            <w:r>
+              <w:t>Modelling</w:t>
+            </w:r>
+          </w:p>
+        </w:tc>
+        <w:tc>
+          <w:tcPr>
+            <w:tcW w:w="1758" w:type="dxa"/>
+          </w:tcPr>
+          <w:p/>
+        </w:tc>
+        <w:tc>
+          <w:tcPr>
+            <w:tcW w:w="1778" w:type="dxa"/>
+          </w:tcPr>
+          <w:p>
+            <w:r>
+              <w:t>Prepared data sets</w:t>
+            </w:r>
+          </w:p>
+        </w:tc>
+        <w:tc>
+          <w:tcPr>
+            <w:tcW w:w="1761" w:type="dxa"/>
+          </w:tcPr>
+          <w:p>
+            <w:r>
+              <w:t>Random Forest regression model</w:t>
+            </w:r>
+          </w:p>
+        </w:tc>
+        <w:tc>
+          <w:tcPr>
+            <w:tcW w:w="1922" w:type="dxa"/>
+          </w:tcPr>
+          <w:p>
+            <w:r>
+              <w:t>Previous phase</w:t>
+            </w:r>
+          </w:p>
+        </w:tc>
+      </w:tr>
+      <w:tr>
+        <w:tc>
+          <w:tcPr>
+            <w:tcW w:w="1797" w:type="dxa"/>
+          </w:tcPr>
+          <w:p>
+            <w:r>
+              <w:t>Evaluation</w:t>
+            </w:r>
+          </w:p>
+        </w:tc>
+        <w:tc>
+          <w:tcPr>
+            <w:tcW w:w="1758" w:type="dxa"/>
+          </w:tcPr>
+          <w:p/>
+        </w:tc>
+        <w:tc>
+          <w:tcPr>
+            <w:tcW w:w="1778" w:type="dxa"/>
+          </w:tcPr>
+          <w:p>
+            <w:proofErr w:type="gramStart"/>
+            <w:r>
+              <w:t>Model</w:t>
+            </w:r>
+            <w:proofErr w:type="gramEnd"/>
+            <w:r>
+              <w:t xml:space="preserve"> predict and test data</w:t>
+            </w:r>
+          </w:p>
+        </w:tc>
+        <w:tc>
+          <w:tcPr>
+            <w:tcW w:w="1761" w:type="dxa"/>
+          </w:tcPr>
+          <w:p>
+            <w:r>
+              <w:t>Evaluate 80% accuracy goal</w:t>
+            </w:r>
+          </w:p>
+        </w:tc>
+        <w:tc>
+          <w:tcPr>
+            <w:tcW w:w="1922" w:type="dxa"/>
+          </w:tcPr>
+          <w:p>
+            <w:r>
+              <w:t>Previous phase</w:t>
+            </w:r>
+          </w:p>
+        </w:tc>
+      </w:tr>
+      <w:tr>
+        <w:tc>
+          <w:tcPr>
+            <w:tcW w:w="1797" w:type="dxa"/>
+          </w:tcPr>
+          <w:p>
+            <w:r>
+              <w:lastRenderedPageBreak/>
+              <w:t>Deployment</w:t>
+            </w:r>
+          </w:p>
+        </w:tc>
+        <w:tc>
+          <w:tcPr>
+            <w:tcW w:w="1758" w:type="dxa"/>
+          </w:tcPr>
+          <w:p/>
+        </w:tc>
+        <w:tc>
+          <w:tcPr>
+            <w:tcW w:w="1778" w:type="dxa"/>
+          </w:tcPr>
+          <w:p>
+            <w:r>
+              <w:t>Final model and evaluation results</w:t>
+            </w:r>
+          </w:p>
+        </w:tc>
+        <w:tc>
+          <w:tcPr>
+            <w:tcW w:w="1761" w:type="dxa"/>
+          </w:tcPr>
+          <w:p>
+            <w:r>
+              <w:t>Power Bi report</w:t>
+            </w:r>
+          </w:p>
+        </w:tc>
+        <w:tc>
+          <w:tcPr>
+            <w:tcW w:w="1922" w:type="dxa"/>
+          </w:tcPr>
+          <w:p>
+            <w:r>
+              <w:t>Previous phase</w:t>
+            </w:r>
+          </w:p>
+        </w:tc>
+      </w:tr>
+    </w:tbl>
+    <w:p>
+      <w:pPr>
         <w:rPr>
           <w:b/>
           <w:bCs/>
-        </w:rPr>
-        <w:t xml:space="preserve">Glossary of Machine Learning Terminology </w:t>
-      </w:r>
-    </w:p>
-    <w:p>
-      <w:r>
-        <w:t xml:space="preserve">Target value (y): </w:t>
-      </w:r>
-      <w:r>
-        <w:t xml:space="preserve">The specific outcome to predict like the Optimal Staff count to </w:t>
-      </w:r>
-      <w:r>
-        <w:t>schedule at a given day</w:t>
-      </w:r>
-    </w:p>
-    <w:p>
-      <w:r>
-        <w:t xml:space="preserve">Features(x): The input </w:t>
-      </w:r>
-      <w:r>
-        <w:t xml:space="preserve">data used to predict (y), </w:t>
-      </w:r>
-      <w:r>
-        <w:t xml:space="preserve">such as “Precipitation” from Met Éireann </w:t>
-      </w:r>
-    </w:p>
-    <w:p>
-      <w:r>
-        <w:t xml:space="preserve">Random Fores: </w:t>
-      </w:r>
-      <w:r>
-        <w:t xml:space="preserve">A machine learning model that combines multiple “decision trees” to provide </w:t>
-      </w:r>
-      <w:r>
-        <w:t>more accurate and stable predictions</w:t>
-      </w:r>
-      <w:r>
-        <w:t xml:space="preserve"> </w:t>
-      </w:r>
-    </w:p>
-    <w:p>
-      <w:pPr>
-        <w:rPr>
-          <w:color w:val="EE0000"/>
-        </w:rPr>
-      </w:pPr>
-      <w:r>
-        <w:rPr>
-          <w:color w:val="EE0000"/>
-        </w:rPr>
-        <w:t>NOTE: EXTEND THIS GLOSSARY AFTER FINISHING THE PROJECT</w:t>
-      </w:r>
-    </w:p>
-    <w:p>
-      <w:pPr>
-        <w:rPr>
-          <w:color w:val="EE0000"/>
-        </w:rPr>
-      </w:pPr>
-    </w:p>
-    <w:p>
-      <w:r>
-        <w:t xml:space="preserve">Cost </w:t>
-      </w:r>
-      <w:r>
-        <w:t xml:space="preserve">and </w:t>
-      </w:r>
-      <w:r>
-        <w:t xml:space="preserve">benefit analysis </w:t>
-      </w:r>
-    </w:p>
-    <w:p>
-      <w:r>
-        <w:t xml:space="preserve">Estimated reject cost: </w:t>
-      </w:r>
-    </w:p>
-    <w:p>
-      <w:r>
-        <w:t>-Personnel: The Analyst is the primary cost</w:t>
-      </w:r>
-      <w:r>
-        <w:t>, the time spent on data cleaning, modelling and evaluation.</w:t>
-      </w:r>
-    </w:p>
-    <w:p>
-      <w:r>
-        <w:t>-Computing resources:</w:t>
-      </w:r>
-      <w:r>
-        <w:t xml:space="preserve"> Software </w:t>
-      </w:r>
-      <w:r>
-        <w:t>like Python/Scikit- Learn are zero cost as we are using open-source tools</w:t>
-      </w:r>
-    </w:p>
-    <w:p>
-      <w:r>
-        <w:t xml:space="preserve">Data acquisition: </w:t>
-      </w:r>
-      <w:r>
-        <w:t>Accessing to Met Eireann and Kaggle data is currently free of charge</w:t>
-      </w:r>
-    </w:p>
-    <w:p>
-      <w:pPr>
-        <w:rPr>
-          <w:color w:val="EE0000"/>
-        </w:rPr>
-      </w:pPr>
-      <w:r>
-        <w:rPr>
-          <w:color w:val="EE0000"/>
-        </w:rPr>
-        <w:t>NOTE, WHAT ABOUT POWER BI, IS IT FREE?</w:t>
-      </w:r>
-    </w:p>
-    <w:p>
-      <w:r>
-        <w:t xml:space="preserve">Potential Benefits: </w:t>
-      </w:r>
-    </w:p>
-    <w:p>
-      <w:r>
-        <w:t>-Reduced Labour waste: By predict low demand days, the hotel can avoid</w:t>
-      </w:r>
-      <w:r>
-        <w:t xml:space="preserve"> unnecessary staff</w:t>
-      </w:r>
-      <w:r>
-        <w:t>.</w:t>
-      </w:r>
-    </w:p>
-    <w:p>
-      <w:r>
-        <w:t xml:space="preserve">-Revenue protection: </w:t>
-      </w:r>
-      <w:r>
-        <w:t xml:space="preserve">On high demand days the hotel will be prepared with the right </w:t>
-      </w:r>
-      <w:proofErr w:type="gramStart"/>
-      <w:r>
-        <w:t>amount</w:t>
-      </w:r>
-      <w:proofErr w:type="gramEnd"/>
-      <w:r>
-        <w:t xml:space="preserve"> of staff, preventing a negative </w:t>
-      </w:r>
-      <w:r>
-        <w:t xml:space="preserve">experience to the guests, avoiding bad reviews, and making their experience unforgettable. </w:t>
-      </w:r>
-    </w:p>
-    <w:p>
-      <w:r>
-        <w:t xml:space="preserve">-Operational </w:t>
-      </w:r>
-      <w:r>
-        <w:t xml:space="preserve">efficiency: An automated system </w:t>
-      </w:r>
-      <w:proofErr w:type="gramStart"/>
-      <w:r>
-        <w:t>reduce</w:t>
-      </w:r>
-      <w:proofErr w:type="gramEnd"/>
-      <w:r>
-        <w:t xml:space="preserve"> the time for manager to manually check weather and calendar events individually.</w:t>
-      </w:r>
-    </w:p>
-    <w:p/>
+          <w:color w:val="EE0000"/>
+        </w:rPr>
+      </w:pPr>
+    </w:p>
     <w:p>
       <w:pPr>
         <w:rPr>
@@ -746,285 +1405,20 @@
     <w:p>
       <w:pPr>
         <w:rPr>
-          <w:color w:val="EE0000"/>
-          <w:u w:val="single"/>
-        </w:rPr>
-      </w:pPr>
-      <w:r>
-        <w:rPr>
-          <w:color w:val="EE0000"/>
-          <w:u w:val="single"/>
-        </w:rPr>
-        <w:t>Inventory of resources:</w:t>
-      </w:r>
-    </w:p>
-    <w:p>
-      <w:pPr>
-        <w:rPr>
-          <w:color w:val="EE0000"/>
-        </w:rPr>
-      </w:pPr>
-      <w:r>
-        <w:rPr>
-          <w:color w:val="EE0000"/>
-        </w:rPr>
-        <w:t>List the resources available to the project</w:t>
-      </w:r>
-      <w:r>
-        <w:rPr>
-          <w:color w:val="EE0000"/>
-        </w:rPr>
-        <w:t xml:space="preserve">, </w:t>
-      </w:r>
-      <w:proofErr w:type="gramStart"/>
-      <w:r>
-        <w:rPr>
-          <w:color w:val="EE0000"/>
-        </w:rPr>
-        <w:t>including:</w:t>
-      </w:r>
-      <w:proofErr w:type="gramEnd"/>
-      <w:r>
-        <w:rPr>
-          <w:color w:val="EE0000"/>
-        </w:rPr>
-        <w:t xml:space="preserve"> personnel (business experts, data experts, technical support, data mining experts), data (fixed extracts, access to live, warehoused, or operational data), computing resources (hardware platforms), and software (data mining/ Machine Learning tools, other relevant software).</w:t>
-      </w:r>
-    </w:p>
-    <w:p>
-      <w:pPr>
-        <w:rPr>
-          <w:color w:val="EE0000"/>
-          <w:u w:val="single"/>
-        </w:rPr>
-      </w:pPr>
-      <w:r>
-        <w:rPr>
-          <w:color w:val="EE0000"/>
-          <w:u w:val="single"/>
-        </w:rPr>
-        <w:t xml:space="preserve">Requirements, assumptions and constraints: </w:t>
-      </w:r>
-    </w:p>
-    <w:p>
-      <w:pPr>
-        <w:rPr>
-          <w:color w:val="EE0000"/>
-        </w:rPr>
-      </w:pPr>
-      <w:r>
-        <w:rPr>
-          <w:color w:val="EE0000"/>
-        </w:rPr>
-        <w:t>Comprehensibility and quality of results, legal issues. List the assumptions made by the project, can include assumptions about the data that can be verified data mining/machine learning or can be a non-verifiable assumption.</w:t>
-      </w:r>
-    </w:p>
-    <w:p>
-      <w:pPr>
-        <w:rPr>
-          <w:color w:val="EE0000"/>
-          <w:u w:val="single"/>
-        </w:rPr>
-      </w:pPr>
-      <w:r>
-        <w:rPr>
-          <w:color w:val="EE0000"/>
-          <w:u w:val="single"/>
-        </w:rPr>
-        <w:t xml:space="preserve">Risk and contingencies: </w:t>
-      </w:r>
-    </w:p>
-    <w:p>
-      <w:pPr>
-        <w:rPr>
-          <w:color w:val="EE0000"/>
-        </w:rPr>
-      </w:pPr>
-      <w:r>
-        <w:rPr>
-          <w:color w:val="EE0000"/>
-        </w:rPr>
-        <w:t>Risk of what can delay the project</w:t>
-      </w:r>
-    </w:p>
-    <w:p>
-      <w:pPr>
-        <w:rPr>
-          <w:color w:val="EE0000"/>
-          <w:u w:val="single"/>
-        </w:rPr>
-      </w:pPr>
-      <w:r>
-        <w:rPr>
-          <w:color w:val="EE0000"/>
-          <w:u w:val="single"/>
-        </w:rPr>
-        <w:t xml:space="preserve">Terminology: </w:t>
-      </w:r>
-    </w:p>
-    <w:p>
-      <w:pPr>
-        <w:rPr>
-          <w:color w:val="EE0000"/>
-        </w:rPr>
-      </w:pPr>
-      <w:r>
-        <w:rPr>
-          <w:color w:val="EE0000"/>
-        </w:rPr>
-        <w:t>Glossary 1: business terminology</w:t>
-      </w:r>
-    </w:p>
-    <w:p>
-      <w:pPr>
-        <w:rPr>
-          <w:color w:val="EE0000"/>
-        </w:rPr>
-      </w:pPr>
-      <w:r>
-        <w:rPr>
-          <w:color w:val="EE0000"/>
-        </w:rPr>
-        <w:t>Glossary 2: data mining/machine learning</w:t>
-      </w:r>
-    </w:p>
-    <w:p>
-      <w:pPr>
-        <w:rPr>
-          <w:color w:val="EE0000"/>
-          <w:u w:val="single"/>
-        </w:rPr>
-      </w:pPr>
-      <w:r>
-        <w:rPr>
-          <w:color w:val="EE0000"/>
-          <w:u w:val="single"/>
-        </w:rPr>
-        <w:t xml:space="preserve"> Cost of benefits: </w:t>
-      </w:r>
-    </w:p>
-    <w:p>
-      <w:pPr>
-        <w:rPr>
-          <w:color w:val="EE0000"/>
-        </w:rPr>
-      </w:pPr>
-      <w:r>
-        <w:rPr>
-          <w:color w:val="EE0000"/>
-        </w:rPr>
-        <w:t>Cost-benefit analysis, be as specific as possible, use monetary measures</w:t>
-      </w:r>
-    </w:p>
-    <w:p>
-      <w:pPr>
-        <w:rPr>
-          <w:color w:val="EE0000"/>
-        </w:rPr>
-      </w:pPr>
-    </w:p>
-    <w:p>
-      <w:pPr>
-        <w:rPr>
-          <w:color w:val="EE0000"/>
-        </w:rPr>
-      </w:pPr>
-    </w:p>
-    <w:p>
-      <w:pPr>
-        <w:rPr>
-          <w:color w:val="EE0000"/>
-        </w:rPr>
-      </w:pPr>
-    </w:p>
-    <w:p>
-      <w:pPr>
-        <w:rPr>
-          <w:color w:val="EE0000"/>
-        </w:rPr>
-      </w:pPr>
-    </w:p>
-    <w:p>
-      <w:pPr>
-        <w:rPr>
           <w:b/>
           <w:bCs/>
           <w:color w:val="EE0000"/>
         </w:rPr>
       </w:pPr>
-      <w:r>
+    </w:p>
+    <w:p>
+      <w:pPr>
         <w:rPr>
           <w:b/>
           <w:bCs/>
           <w:color w:val="EE0000"/>
         </w:rPr>
-        <w:t>Determine data mining/Machine Learning goals</w:t>
-      </w:r>
-    </w:p>
-    <w:p>
-      <w:pPr>
-        <w:rPr>
-          <w:color w:val="EE0000"/>
-        </w:rPr>
-      </w:pPr>
-      <w:r>
-        <w:rPr>
-          <w:color w:val="EE0000"/>
-        </w:rPr>
-        <w:t>Set and explain the goals but NOT in a business terminology, this time in technical terms</w:t>
-      </w:r>
-      <w:r>
-        <w:rPr>
-          <w:color w:val="EE0000"/>
-        </w:rPr>
-        <w:t xml:space="preserve">. Try to answer this question: What does the business need to see to consider this project a win? Be specific with percentages. </w:t>
-      </w:r>
-    </w:p>
-    <w:p>
-      <w:pPr>
-        <w:rPr>
-          <w:color w:val="EE0000"/>
-        </w:rPr>
-      </w:pPr>
-      <w:r>
-        <w:rPr>
-          <w:color w:val="EE0000"/>
-        </w:rPr>
-        <w:t xml:space="preserve">- Outputs </w:t>
-      </w:r>
-    </w:p>
-    <w:p>
-      <w:pPr>
-        <w:rPr>
-          <w:color w:val="EE0000"/>
-        </w:rPr>
-      </w:pPr>
-      <w:r>
-        <w:rPr>
-          <w:color w:val="EE0000"/>
-        </w:rPr>
-        <w:t xml:space="preserve">1. Business success criteria – describe the intended outputs of the project that enable the achievement of the business objectives. </w:t>
-      </w:r>
-    </w:p>
-    <w:p>
-      <w:pPr>
-        <w:rPr>
-          <w:color w:val="EE0000"/>
-        </w:rPr>
-      </w:pPr>
-      <w:r>
-        <w:rPr>
-          <w:color w:val="EE0000"/>
-        </w:rPr>
-        <w:t xml:space="preserve">2. Data mining / Machine Learning success criteria – define the criteria for a successful outcome to the project in technical terms—for example, a certain level of predictive </w:t>
-      </w:r>
-      <w:r>
-        <w:rPr>
-          <w:color w:val="EE0000"/>
-        </w:rPr>
-        <w:lastRenderedPageBreak/>
-        <w:t>accuracy or a propensity-to-purchase profile with a given degree of “lift.” As with business success criteria, it may be necessary to describe these in subjective terms, in which case the person or persons making the subjective judgment should be identified.</w:t>
-      </w:r>
+      </w:pPr>
     </w:p>
     <w:p>
       <w:pPr>
@@ -1034,50 +1428,16 @@
           <w:color w:val="EE0000"/>
         </w:rPr>
       </w:pPr>
-    </w:p>
-    <w:p>
-      <w:pPr>
+      <w:r>
         <w:rPr>
           <w:b/>
           <w:bCs/>
           <w:color w:val="EE0000"/>
         </w:rPr>
-      </w:pPr>
-      <w:r>
-        <w:rPr>
-          <w:b/>
-          <w:bCs/>
-          <w:color w:val="EE0000"/>
-        </w:rPr>
-        <w:t>Produce project plan</w:t>
-      </w:r>
-    </w:p>
-    <w:p>
-      <w:pPr>
-        <w:rPr>
-          <w:color w:val="EE0000"/>
-        </w:rPr>
-      </w:pPr>
-      <w:r>
-        <w:rPr>
-          <w:color w:val="EE0000"/>
-        </w:rPr>
-        <w:t>Describe the plan for achieving the data mining/machine learning goals. The plan should specify steps to be performed including tools and techniques.</w:t>
-      </w:r>
-    </w:p>
-    <w:p>
-      <w:pPr>
-        <w:rPr>
-          <w:color w:val="EE0000"/>
-        </w:rPr>
-      </w:pPr>
-      <w:r>
-        <w:rPr>
-          <w:color w:val="EE0000"/>
-        </w:rPr>
-        <w:t xml:space="preserve">- 1. Project plan – list the stages to be executed in the project, together with their duration, resources required, inputs, outputs, and dependencies. Where possible, make explicit the large-scale iterations in the data mining process—for example, repetitions of the modelling and evaluation phases. As part of the project plan, it is also important to analyse dependencies between time schedule and risks. Mark results of these analyses explicitly in the project plan, ideally with actions and recommendations if the risks are manifested. Note: the project plan contains detailed plans for each phase. Decide at this point which evaluation strategy will be used in the evaluation phase. The project plan is a dynamic document in the sense that at the end of each phase, a review of progress and achievements is necessary, and a corresponding update of the project plan is recommended. Specific review points for these updates are part of the project plan. </w:t>
-      </w:r>
-    </w:p>
+        <w:br w:type="page"/>
+      </w:r>
+    </w:p>
+    <w:p/>
     <w:p>
       <w:pPr>
         <w:rPr>
@@ -1091,6 +1451,112 @@
         <w:t>2. Initial assessment of tools and techniques – at the end of the first phase, an initial assessment of tools and techniques should be performed. Here, for example, you select a data mining tool that supports various methods for different stages of the process. It is important to assess tools and techniques early in the process since the selection of tools and techniques may influence the entire project.</w:t>
       </w:r>
     </w:p>
+    <w:p>
+      <w:pPr>
+        <w:rPr>
+          <w:color w:val="EE0000"/>
+        </w:rPr>
+      </w:pPr>
+    </w:p>
+    <w:p>
+      <w:r>
+        <w:t>THIS IS THE</w:t>
+      </w:r>
+      <w:r>
+        <w:t xml:space="preserve"> GENERAL IDEA OF THE PROJECT, ORGANISE IT AND EXPLAIN IT CLEAR LATER: </w:t>
+      </w:r>
+    </w:p>
+    <w:p>
+      <w:r>
+        <w:t>3 DATA SETS</w:t>
+      </w:r>
+    </w:p>
+    <w:p>
+      <w:r>
+        <w:t>1 MET EIREAN, 2 HOTEL OCCUPANCY, 3 EVENTS</w:t>
+      </w:r>
+    </w:p>
+    <w:p>
+      <w:r>
+        <w:t xml:space="preserve">1 I DON’T NEED ALL THE MET EIREAN DATA SET, ONLY THE MOST IMPORTANT COLUMS SUCH AS </w:t>
+      </w:r>
+      <w:r>
+        <w:t xml:space="preserve">“MAX TEMEPERATURE”, “MIN TEMP”, “PRECIPITATION”, I ONLY NEED TO KNOW HOW WARM </w:t>
+      </w:r>
+      <w:r>
+        <w:t xml:space="preserve">IS AND HOW RAINY IS. </w:t>
+      </w:r>
+    </w:p>
+    <w:p>
+      <w:r>
+        <w:t xml:space="preserve">2 HOTEL OCUPANCY, I ONLY NEED 2 COLUMS, DATE AND OCUPANCY, I DON’T NEED TO KNOW WHO THE GUEST IS, HOW MANY DAYS THEY STAYED ETC. </w:t>
+      </w:r>
+    </w:p>
+    <w:p>
+      <w:r>
+        <w:t>3</w:t>
+      </w:r>
+      <w:r>
+        <w:t xml:space="preserve"> THERE IS NO WAY TO KNOW IN ONLY 1 DATA SET THE </w:t>
+      </w:r>
+      <w:r>
+        <w:t>FUTURE EVENTS, THIS EVENTS HAVE TO BE PLANNED IN ADVANCE</w:t>
+      </w:r>
+      <w:r>
+        <w:t xml:space="preserve">, </w:t>
+      </w:r>
+      <w:proofErr w:type="gramStart"/>
+      <w:r>
+        <w:t>LETS</w:t>
+      </w:r>
+      <w:proofErr w:type="gramEnd"/>
+      <w:r>
+        <w:t xml:space="preserve"> SAY 6 MONTHS IN ADVANCE. I WILL CREATE THIS MYSELF </w:t>
+      </w:r>
+      <w:r>
+        <w:t>AND JUST DEFINE IF IS A BIG EVENT OR NO</w:t>
+      </w:r>
+      <w:r>
+        <w:t xml:space="preserve">T, THIS CAN BE A BINARY INPUT. </w:t>
+      </w:r>
+    </w:p>
+    <w:p>
+      <w:r>
+        <w:t>USIGN PYTHON MERGE THE COLUMNS</w:t>
+      </w:r>
+      <w:r>
+        <w:t xml:space="preserve"> AND USE RANDOM FOREST TO PREDICT </w:t>
+      </w:r>
+    </w:p>
+    <w:p>
+      <w:proofErr w:type="gramStart"/>
+      <w:r>
+        <w:t>FIRST OF ALL</w:t>
+      </w:r>
+      <w:proofErr w:type="gramEnd"/>
+      <w:r>
+        <w:t xml:space="preserve"> I AM GOING TO SELECT THE WEATER VARIABLES</w:t>
+      </w:r>
+      <w:r>
+        <w:t xml:space="preserve"> FROM GLASNEVIN IRELAND LOCATION (I COULD CHOOSE ANY OF THE </w:t>
+      </w:r>
+      <w:r>
+        <w:t>506 STATIONS IN IRELAND DEPENDING ON THE HOTEL LOCATION</w:t>
+      </w:r>
+      <w:r>
+        <w:t>)</w:t>
+      </w:r>
+    </w:p>
+    <w:p>
+      <w:r>
+        <w:t xml:space="preserve">POWER BI AND </w:t>
+      </w:r>
+      <w:r>
+        <w:t>VISUALS NOT DEFINED YET</w:t>
+      </w:r>
+    </w:p>
+    <w:p/>
+    <w:p/>
     <w:sectPr>
       <w:pgSz w:w="11906" w:h="16838"/>
       <w:pgMar w:top="1440" w:right="1440" w:bottom="1440" w:left="1440" w:header="720" w:footer="720" w:gutter="0"/>
@@ -1501,7 +1967,7 @@
   <w:style w:type="paragraph" w:default="1" w:styleId="Normal">
     <w:name w:val="Normal"/>
     <w:qFormat/>
-    <w:rsid w:val="00461B90"/>
+    <w:rsid w:val="00F44AE5"/>
   </w:style>
   <w:style w:type="paragraph" w:styleId="Heading1">
     <w:name w:val="heading 1"/>
@@ -1705,7 +2171,6 @@
   <w:style w:type="character" w:default="1" w:styleId="DefaultParagraphFont">
     <w:name w:val="Default Paragraph Font"/>
     <w:uiPriority w:val="1"/>
-    <w:semiHidden/>
     <w:unhideWhenUsed/>
   </w:style>
   <w:style w:type="table" w:default="1" w:styleId="TableNormal">
@@ -2018,6 +2483,25 @@
       <w:color w:val="0F4761" w:themeColor="accent1" w:themeShade="BF"/>
       <w:spacing w:val="5"/>
     </w:rPr>
+  </w:style>
+  <w:style w:type="table" w:styleId="TableGrid">
+    <w:name w:val="Table Grid"/>
+    <w:basedOn w:val="TableNormal"/>
+    <w:uiPriority w:val="39"/>
+    <w:rsid w:val="00D927FE"/>
+    <w:pPr>
+      <w:spacing w:after="0" w:line="240" w:lineRule="auto"/>
+    </w:pPr>
+    <w:tblPr>
+      <w:tblBorders>
+        <w:top w:val="single" w:sz="4" w:space="0" w:color="auto"/>
+        <w:left w:val="single" w:sz="4" w:space="0" w:color="auto"/>
+        <w:bottom w:val="single" w:sz="4" w:space="0" w:color="auto"/>
+        <w:right w:val="single" w:sz="4" w:space="0" w:color="auto"/>
+        <w:insideH w:val="single" w:sz="4" w:space="0" w:color="auto"/>
+        <w:insideV w:val="single" w:sz="4" w:space="0" w:color="auto"/>
+      </w:tblBorders>
+    </w:tblPr>
   </w:style>
 </w:styles>
 </file>

</xml_diff>